<commit_message>
firmware and enclosure card updates
</commit_message>
<xml_diff>
--- a/iot/esp32/ENCLOSURE-CARD.docx
+++ b/iot/esp32/ENCLOSURE-CARD.docx
@@ -333,15 +333,15 @@
                 <w:sz w:val="19"/>
                 <w:szCs w:val="19"/>
               </w:rPr>
-              <w:t xml:space="preserve">BOOT</w:t>
-            </w:r>
-            <w:r>
-              <w:rPr>
-                <w:rFonts w:ascii="Calibri" w:cs="Calibri" w:eastAsia="Calibri" w:hAnsi="Calibri"/>
-                <w:sz w:val="19"/>
-                <w:szCs w:val="19"/>
-              </w:rPr>
-              <w:t xml:space="preserve"> now if you want to change the WiFi — 4 seconds only</w:t>
+              <w:t xml:space="preserve">SETUP</w:t>
+            </w:r>
+            <w:r>
+              <w:rPr>
+                <w:rFonts w:ascii="Calibri" w:cs="Calibri" w:eastAsia="Calibri" w:hAnsi="Calibri"/>
+                <w:sz w:val="19"/>
+                <w:szCs w:val="19"/>
+              </w:rPr>
+              <w:t xml:space="preserve"> (or BOOT) now if you want to change the WiFi — 4 seconds only</w:t>
             </w:r>
           </w:p>
         </w:tc>
@@ -654,6 +654,79 @@
                 <w:szCs w:val="19"/>
               </w:rPr>
               <w:t xml:space="preserve">Normal</w:t>
+            </w:r>
+          </w:p>
+        </w:tc>
+      </w:tr>
+      <w:tr>
+        <w:trPr>
+          <w:tblHeader w:val="false"/>
+        </w:trPr>
+        <w:tc>
+          <w:tcPr>
+            <w:tcW w:type="dxa" w:w="2534"/>
+            <w:tcMar>
+              <w:top w:type="dxa" w:w="60"/>
+              <w:left w:type="dxa" w:w="110"/>
+              <w:bottom w:type="dxa" w:w="60"/>
+              <w:right w:type="dxa" w:w="110"/>
+            </w:tcMar>
+          </w:tcPr>
+          <w:p>
+            <w:pPr>
+              <w:spacing w:after="0" w:before="0" w:line="252"/>
+            </w:pPr>
+            <w:r>
+              <w:rPr>
+                <w:rFonts w:ascii="Calibri" w:cs="Calibri" w:eastAsia="Calibri" w:hAnsi="Calibri"/>
+                <w:b/>
+                <w:bCs/>
+                <w:sz w:val="19"/>
+                <w:szCs w:val="19"/>
+              </w:rPr>
+              <w:t xml:space="preserve">Magenta</w:t>
+            </w:r>
+          </w:p>
+        </w:tc>
+        <w:tc>
+          <w:tcPr>
+            <w:tcW w:type="dxa" w:w="7212"/>
+            <w:tcMar>
+              <w:top w:type="dxa" w:w="60"/>
+              <w:left w:type="dxa" w:w="110"/>
+              <w:bottom w:type="dxa" w:w="60"/>
+              <w:right w:type="dxa" w:w="110"/>
+            </w:tcMar>
+          </w:tcPr>
+          <w:p>
+            <w:pPr>
+              <w:spacing w:after="0" w:before="0" w:line="252"/>
+            </w:pPr>
+            <w:r>
+              <w:rPr>
+                <w:rFonts w:ascii="Calibri" w:cs="Calibri" w:eastAsia="Calibri" w:hAnsi="Calibri"/>
+                <w:sz w:val="19"/>
+                <w:szCs w:val="19"/>
+              </w:rPr>
+              <w:t xml:space="preserve">You are holding </w:t>
+            </w:r>
+            <w:r>
+              <w:rPr>
+                <w:rFonts w:ascii="Calibri" w:cs="Calibri" w:eastAsia="Calibri" w:hAnsi="Calibri"/>
+                <w:b/>
+                <w:bCs/>
+                <w:sz w:val="19"/>
+                <w:szCs w:val="19"/>
+              </w:rPr>
+              <w:t xml:space="preserve">SETUP</w:t>
+            </w:r>
+            <w:r>
+              <w:rPr>
+                <w:rFonts w:ascii="Calibri" w:cs="Calibri" w:eastAsia="Calibri" w:hAnsi="Calibri"/>
+                <w:sz w:val="19"/>
+                <w:szCs w:val="19"/>
+              </w:rPr>
+              <w:t xml:space="preserve">. Keep holding — at 3 s it blinks green once, then restarts into WiFi setup</w:t>
             </w:r>
           </w:p>
         </w:tc>
@@ -2550,7 +2623,25 @@
                 <w:sz w:val="19"/>
                 <w:szCs w:val="19"/>
               </w:rPr>
-              <w:t xml:space="preserve">On the box — section 5</w:t>
+              <w:t xml:space="preserve">On the box — hold </w:t>
+            </w:r>
+            <w:r>
+              <w:rPr>
+                <w:rFonts w:ascii="Calibri" w:cs="Calibri" w:eastAsia="Calibri" w:hAnsi="Calibri"/>
+                <w:b/>
+                <w:bCs/>
+                <w:sz w:val="19"/>
+                <w:szCs w:val="19"/>
+              </w:rPr>
+              <w:t xml:space="preserve">SETUP</w:t>
+            </w:r>
+            <w:r>
+              <w:rPr>
+                <w:rFonts w:ascii="Calibri" w:cs="Calibri" w:eastAsia="Calibri" w:hAnsi="Calibri"/>
+                <w:sz w:val="19"/>
+                <w:szCs w:val="19"/>
+              </w:rPr>
+              <w:t xml:space="preserve"> 3 s, section 5</w:t>
             </w:r>
           </w:p>
         </w:tc>
@@ -2857,6 +2948,65 @@
     </w:p>
     <w:p>
       <w:pPr>
+        <w:spacing w:after="100" w:before="60" w:line="264"/>
+      </w:pPr>
+      <w:r>
+        <w:rPr>
+          <w:rFonts w:ascii="Calibri" w:cs="Calibri" w:eastAsia="Calibri" w:hAnsi="Calibri"/>
+          <w:b/>
+          <w:bCs/>
+          <w:sz w:val="19"/>
+          <w:szCs w:val="19"/>
+        </w:rPr>
+        <w:t xml:space="preserve">Leave the box plugged in. </w:t>
+      </w:r>
+      <w:r>
+        <w:rPr>
+          <w:rFonts w:ascii="Calibri" w:cs="Calibri" w:eastAsia="Calibri" w:hAnsi="Calibri"/>
+          <w:sz w:val="19"/>
+          <w:szCs w:val="19"/>
+        </w:rPr>
+        <w:t xml:space="preserve">Hold the </w:t>
+      </w:r>
+      <w:r>
+        <w:rPr>
+          <w:rFonts w:ascii="Calibri" w:cs="Calibri" w:eastAsia="Calibri" w:hAnsi="Calibri"/>
+          <w:b/>
+          <w:bCs/>
+          <w:sz w:val="19"/>
+          <w:szCs w:val="19"/>
+        </w:rPr>
+        <w:t xml:space="preserve">SETUP</w:t>
+      </w:r>
+      <w:r>
+        <w:rPr>
+          <w:rFonts w:ascii="Calibri" w:cs="Calibri" w:eastAsia="Calibri" w:hAnsi="Calibri"/>
+          <w:sz w:val="19"/>
+          <w:szCs w:val="19"/>
+        </w:rPr>
+        <w:t xml:space="preserve"> button for a full </w:t>
+      </w:r>
+      <w:r>
+        <w:rPr>
+          <w:rFonts w:ascii="Calibri" w:cs="Calibri" w:eastAsia="Calibri" w:hAnsi="Calibri"/>
+          <w:b/>
+          <w:bCs/>
+          <w:sz w:val="19"/>
+          <w:szCs w:val="19"/>
+        </w:rPr>
+        <w:t xml:space="preserve">3 seconds</w:t>
+      </w:r>
+      <w:r>
+        <w:rPr>
+          <w:rFonts w:ascii="Calibri" w:cs="Calibri" w:eastAsia="Calibri" w:hAnsi="Calibri"/>
+          <w:sz w:val="19"/>
+          <w:szCs w:val="19"/>
+        </w:rPr>
+        <w:t xml:space="preserve"> — the box restarts itself into the setup page. Nothing to unplug, no window to catch.</w:t>
+      </w:r>
+    </w:p>
+    <w:p>
+      <w:pPr>
         <w:pStyle w:val="ListParagraph"/>
         <w:keepLines/>
         <w:numPr>
@@ -2871,7 +3021,7 @@
           <w:sz w:val="19"/>
           <w:szCs w:val="19"/>
         </w:rPr>
-        <w:t xml:space="preserve">Plug the box in — </w:t>
+        <w:t xml:space="preserve">Hold </w:t>
       </w:r>
       <w:r>
         <w:rPr>
@@ -2881,15 +3031,33 @@
           <w:sz w:val="19"/>
           <w:szCs w:val="19"/>
         </w:rPr>
-        <w:t xml:space="preserve">do not touch any button yet</w:t>
-      </w:r>
-      <w:r>
-        <w:rPr>
-          <w:rFonts w:ascii="Calibri" w:cs="Calibri" w:eastAsia="Calibri" w:hAnsi="Calibri"/>
-          <w:sz w:val="19"/>
-          <w:szCs w:val="19"/>
-        </w:rPr>
-        <w:t xml:space="preserve">.</w:t>
+        <w:t xml:space="preserve">SETUP</w:t>
+      </w:r>
+      <w:r>
+        <w:rPr>
+          <w:rFonts w:ascii="Calibri" w:cs="Calibri" w:eastAsia="Calibri" w:hAnsi="Calibri"/>
+          <w:sz w:val="19"/>
+          <w:szCs w:val="19"/>
+        </w:rPr>
+        <w:t xml:space="preserve">. The light turns </w:t>
+      </w:r>
+      <w:r>
+        <w:rPr>
+          <w:rFonts w:ascii="Calibri" w:cs="Calibri" w:eastAsia="Calibri" w:hAnsi="Calibri"/>
+          <w:b/>
+          <w:bCs/>
+          <w:sz w:val="19"/>
+          <w:szCs w:val="19"/>
+        </w:rPr>
+        <w:t xml:space="preserve">magenta</w:t>
+      </w:r>
+      <w:r>
+        <w:rPr>
+          <w:rFonts w:ascii="Calibri" w:cs="Calibri" w:eastAsia="Calibri" w:hAnsi="Calibri"/>
+          <w:sz w:val="19"/>
+          <w:szCs w:val="19"/>
+        </w:rPr>
+        <w:t xml:space="preserve"> while the 3 seconds count.</w:t>
       </w:r>
     </w:p>
     <w:p>
@@ -2908,7 +3076,7 @@
           <w:sz w:val="19"/>
           <w:szCs w:val="19"/>
         </w:rPr>
-        <w:t xml:space="preserve">After about 4 seconds the light turns </w:t>
+        <w:t xml:space="preserve">It blinks </w:t>
       </w:r>
       <w:r>
         <w:rPr>
@@ -2918,15 +3086,15 @@
           <w:sz w:val="19"/>
           <w:szCs w:val="19"/>
         </w:rPr>
-        <w:t xml:space="preserve">magenta</w:t>
-      </w:r>
-      <w:r>
-        <w:rPr>
-          <w:rFonts w:ascii="Calibri" w:cs="Calibri" w:eastAsia="Calibri" w:hAnsi="Calibri"/>
-          <w:sz w:val="19"/>
-          <w:szCs w:val="19"/>
-        </w:rPr>
-        <w:t xml:space="preserve">.</w:t>
+        <w:t xml:space="preserve">green</w:t>
+      </w:r>
+      <w:r>
+        <w:rPr>
+          <w:rFonts w:ascii="Calibri" w:cs="Calibri" w:eastAsia="Calibri" w:hAnsi="Calibri"/>
+          <w:sz w:val="19"/>
+          <w:szCs w:val="19"/>
+        </w:rPr>
+        <w:t xml:space="preserve"> once — the hold registered. Let go; the box restarts on its own.</w:t>
       </w:r>
     </w:p>
     <w:p>
@@ -2945,25 +3113,7 @@
           <w:sz w:val="19"/>
           <w:szCs w:val="19"/>
         </w:rPr>
-        <w:t xml:space="preserve">While it is magenta, </w:t>
-      </w:r>
-      <w:r>
-        <w:rPr>
-          <w:rFonts w:ascii="Calibri" w:cs="Calibri" w:eastAsia="Calibri" w:hAnsi="Calibri"/>
-          <w:b/>
-          <w:bCs/>
-          <w:sz w:val="19"/>
-          <w:szCs w:val="19"/>
-        </w:rPr>
-        <w:t xml:space="preserve">press BOOT once</w:t>
-      </w:r>
-      <w:r>
-        <w:rPr>
-          <w:rFonts w:ascii="Calibri" w:cs="Calibri" w:eastAsia="Calibri" w:hAnsi="Calibri"/>
-          <w:sz w:val="19"/>
-          <w:szCs w:val="19"/>
-        </w:rPr>
-        <w:t xml:space="preserve"> (marked </w:t>
+        <w:t xml:space="preserve">The setup page comes up by itself. On your phone, join the WiFi </w:t>
       </w:r>
       <w:r>
         <w:rPr>
@@ -2972,15 +3122,15 @@
           <w:sz w:val="18"/>
           <w:szCs w:val="18"/>
         </w:rPr>
-        <w:t xml:space="preserve">BOOT</w:t>
-      </w:r>
-      <w:r>
-        <w:rPr>
-          <w:rFonts w:ascii="Calibri" w:cs="Calibri" w:eastAsia="Calibri" w:hAnsi="Calibri"/>
-          <w:sz w:val="19"/>
-          <w:szCs w:val="19"/>
-        </w:rPr>
-        <w:t xml:space="preserve"> or </w:t>
+        <w:t xml:space="preserve">CSPC-ICTU-Sensor-XXXX</w:t>
+      </w:r>
+      <w:r>
+        <w:rPr>
+          <w:rFonts w:ascii="Calibri" w:cs="Calibri" w:eastAsia="Calibri" w:hAnsi="Calibri"/>
+          <w:sz w:val="19"/>
+          <w:szCs w:val="19"/>
+        </w:rPr>
+        <w:t xml:space="preserve"> (no password) — if the page does not open, go to </w:t>
       </w:r>
       <w:r>
         <w:rPr>
@@ -2989,15 +3139,15 @@
           <w:sz w:val="18"/>
           <w:szCs w:val="18"/>
         </w:rPr>
-        <w:t xml:space="preserve">IO0</w:t>
-      </w:r>
-      <w:r>
-        <w:rPr>
-          <w:rFonts w:ascii="Calibri" w:cs="Calibri" w:eastAsia="Calibri" w:hAnsi="Calibri"/>
-          <w:sz w:val="19"/>
-          <w:szCs w:val="19"/>
-        </w:rPr>
-        <w:t xml:space="preserve">).</w:t>
+        <w:t xml:space="preserve">http://192.168.4.1</w:t>
+      </w:r>
+      <w:r>
+        <w:rPr>
+          <w:rFonts w:ascii="Calibri" w:cs="Calibri" w:eastAsia="Calibri" w:hAnsi="Calibri"/>
+          <w:sz w:val="19"/>
+          <w:szCs w:val="19"/>
+        </w:rPr>
+        <w:t xml:space="preserve">.</w:t>
       </w:r>
     </w:p>
     <w:p>
@@ -3013,10 +3163,56 @@
       <w:r>
         <w:rPr>
           <w:rFonts w:ascii="Calibri" w:cs="Calibri" w:eastAsia="Calibri" w:hAnsi="Calibri"/>
-          <w:sz w:val="19"/>
-          <w:szCs w:val="19"/>
-        </w:rPr>
-        <w:t xml:space="preserve">On your phone, join the WiFi </w:t>
+          <w:b/>
+          <w:bCs/>
+          <w:sz w:val="19"/>
+          <w:szCs w:val="19"/>
+        </w:rPr>
+        <w:t xml:space="preserve">Configure WiFi</w:t>
+      </w:r>
+      <w:r>
+        <w:rPr>
+          <w:rFonts w:ascii="Calibri" w:cs="Calibri" w:eastAsia="Calibri" w:hAnsi="Calibri"/>
+          <w:sz w:val="19"/>
+          <w:szCs w:val="19"/>
+        </w:rPr>
+        <w:t xml:space="preserve"> → pick the network (</w:t>
+      </w:r>
+      <w:r>
+        <w:rPr>
+          <w:rFonts w:ascii="Calibri" w:cs="Calibri" w:eastAsia="Calibri" w:hAnsi="Calibri"/>
+          <w:b/>
+          <w:bCs/>
+          <w:sz w:val="19"/>
+          <w:szCs w:val="19"/>
+        </w:rPr>
+        <w:t xml:space="preserve">2.4 GHz only</w:t>
+      </w:r>
+      <w:r>
+        <w:rPr>
+          <w:rFonts w:ascii="Calibri" w:cs="Calibri" w:eastAsia="Calibri" w:hAnsi="Calibri"/>
+          <w:sz w:val="19"/>
+          <w:szCs w:val="19"/>
+        </w:rPr>
+        <w:t xml:space="preserve">), type the password, enter the </w:t>
+      </w:r>
+      <w:r>
+        <w:rPr>
+          <w:rFonts w:ascii="Calibri" w:cs="Calibri" w:eastAsia="Calibri" w:hAnsi="Calibri"/>
+          <w:b/>
+          <w:bCs/>
+          <w:sz w:val="19"/>
+          <w:szCs w:val="19"/>
+        </w:rPr>
+        <w:t xml:space="preserve">Backend IP</w:t>
+      </w:r>
+      <w:r>
+        <w:rPr>
+          <w:rFonts w:ascii="Calibri" w:cs="Calibri" w:eastAsia="Calibri" w:hAnsi="Calibri"/>
+          <w:sz w:val="19"/>
+          <w:szCs w:val="19"/>
+        </w:rPr>
+        <w:t xml:space="preserve"> and port </w:t>
       </w:r>
       <w:r>
         <w:rPr>
@@ -3025,24 +3221,7 @@
           <w:sz w:val="18"/>
           <w:szCs w:val="18"/>
         </w:rPr>
-        <w:t xml:space="preserve">CSPC-ICTU-Sensor-XXXX</w:t>
-      </w:r>
-      <w:r>
-        <w:rPr>
-          <w:rFonts w:ascii="Calibri" w:cs="Calibri" w:eastAsia="Calibri" w:hAnsi="Calibri"/>
-          <w:sz w:val="19"/>
-          <w:szCs w:val="19"/>
-        </w:rPr>
-        <w:t xml:space="preserve"> (no password). The setup page opens by itself — if not, go to </w:t>
-      </w:r>
-      <w:r>
-        <w:rPr>
-          <w:rFonts w:ascii="Consolas" w:cs="Consolas" w:eastAsia="Consolas" w:hAnsi="Consolas"/>
-          <w:color w:val="2B3A55"/>
-          <w:sz w:val="18"/>
-          <w:szCs w:val="18"/>
-        </w:rPr>
-        <w:t xml:space="preserve">http://192.168.4.1</w:t>
+        <w:t xml:space="preserve">3000</w:t>
       </w:r>
       <w:r>
         <w:rPr>
@@ -3071,15 +3250,15 @@
           <w:sz w:val="19"/>
           <w:szCs w:val="19"/>
         </w:rPr>
-        <w:t xml:space="preserve">Configure WiFi</w:t>
-      </w:r>
-      <w:r>
-        <w:rPr>
-          <w:rFonts w:ascii="Calibri" w:cs="Calibri" w:eastAsia="Calibri" w:hAnsi="Calibri"/>
-          <w:sz w:val="19"/>
-          <w:szCs w:val="19"/>
-        </w:rPr>
-        <w:t xml:space="preserve"> → pick the network (</w:t>
+        <w:t xml:space="preserve">Save</w:t>
+      </w:r>
+      <w:r>
+        <w:rPr>
+          <w:rFonts w:ascii="Calibri" w:cs="Calibri" w:eastAsia="Calibri" w:hAnsi="Calibri"/>
+          <w:sz w:val="19"/>
+          <w:szCs w:val="19"/>
+        </w:rPr>
+        <w:t xml:space="preserve">, and wait for the page to say </w:t>
       </w:r>
       <w:r>
         <w:rPr>
@@ -3089,15 +3268,33 @@
           <w:sz w:val="19"/>
           <w:szCs w:val="19"/>
         </w:rPr>
-        <w:t xml:space="preserve">2.4 GHz only</w:t>
-      </w:r>
-      <w:r>
-        <w:rPr>
-          <w:rFonts w:ascii="Calibri" w:cs="Calibri" w:eastAsia="Calibri" w:hAnsi="Calibri"/>
-          <w:sz w:val="19"/>
-          <w:szCs w:val="19"/>
-        </w:rPr>
-        <w:t xml:space="preserve">), type the password, enter the </w:t>
+        <w:t xml:space="preserve">Connected</w:t>
+      </w:r>
+      <w:r>
+        <w:rPr>
+          <w:rFonts w:ascii="Calibri" w:cs="Calibri" w:eastAsia="Calibri" w:hAnsi="Calibri"/>
+          <w:sz w:val="19"/>
+          <w:szCs w:val="19"/>
+        </w:rPr>
+        <w:t xml:space="preserve">.</w:t>
+      </w:r>
+    </w:p>
+    <w:p>
+      <w:pPr>
+        <w:pBdr>
+          <w:left w:val="single" w:color="2B3A55" w:sz="18" w:space="8"/>
+        </w:pBdr>
+        <w:shd w:fill="F4F6F9" w:color="auto" w:val="clear"/>
+        <w:spacing w:after="140" w:before="140" w:line="264"/>
+        <w:ind w:left="180" w:right="180"/>
+      </w:pPr>
+      <w:r>
+        <w:rPr>
+          <w:rFonts w:ascii="Calibri" w:cs="Calibri" w:eastAsia="Calibri" w:hAnsi="Calibri"/>
+          <w:sz w:val="19"/>
+          <w:szCs w:val="19"/>
+        </w:rPr>
+        <w:t xml:space="preserve">The 3 seconds must be unbroken — let go early and the count starts over. </w:t>
       </w:r>
       <w:r>
         <w:rPr>
@@ -3107,15 +3304,195 @@
           <w:sz w:val="19"/>
           <w:szCs w:val="19"/>
         </w:rPr>
-        <w:t xml:space="preserve">Backend IP</w:t>
-      </w:r>
-      <w:r>
-        <w:rPr>
-          <w:rFonts w:ascii="Calibri" w:cs="Calibri" w:eastAsia="Calibri" w:hAnsi="Calibri"/>
-          <w:sz w:val="19"/>
-          <w:szCs w:val="19"/>
-        </w:rPr>
-        <w:t xml:space="preserve"> and port </w:t>
+        <w:t xml:space="preserve">During an alarm there is no magenta</w:t>
+      </w:r>
+      <w:r>
+        <w:rPr>
+          <w:rFonts w:ascii="Calibri" w:cs="Calibri" w:eastAsia="Calibri" w:hAnsi="Calibri"/>
+          <w:sz w:val="19"/>
+          <w:szCs w:val="19"/>
+        </w:rPr>
+        <w:t xml:space="preserve"> (the alarm colour keeps the light), but the hold still counts: watch for the green blink. The setup page waits about </w:t>
+      </w:r>
+      <w:r>
+        <w:rPr>
+          <w:rFonts w:ascii="Calibri" w:cs="Calibri" w:eastAsia="Calibri" w:hAnsi="Calibri"/>
+          <w:b/>
+          <w:bCs/>
+          <w:sz w:val="19"/>
+          <w:szCs w:val="19"/>
+        </w:rPr>
+        <w:t xml:space="preserve">3 minutes</w:t>
+      </w:r>
+      <w:r>
+        <w:rPr>
+          <w:rFonts w:ascii="Calibri" w:cs="Calibri" w:eastAsia="Calibri" w:hAnsi="Calibri"/>
+          <w:sz w:val="19"/>
+          <w:szCs w:val="19"/>
+        </w:rPr>
+        <w:t xml:space="preserve">; if nobody connects, the box goes back to monitoring — hold </w:t>
+      </w:r>
+      <w:r>
+        <w:rPr>
+          <w:rFonts w:ascii="Calibri" w:cs="Calibri" w:eastAsia="Calibri" w:hAnsi="Calibri"/>
+          <w:b/>
+          <w:bCs/>
+          <w:sz w:val="19"/>
+          <w:szCs w:val="19"/>
+        </w:rPr>
+        <w:t xml:space="preserve">SETUP</w:t>
+      </w:r>
+      <w:r>
+        <w:rPr>
+          <w:rFonts w:ascii="Calibri" w:cs="Calibri" w:eastAsia="Calibri" w:hAnsi="Calibri"/>
+          <w:sz w:val="19"/>
+          <w:szCs w:val="19"/>
+        </w:rPr>
+        <w:t xml:space="preserve"> again.</w:t>
+      </w:r>
+    </w:p>
+    <w:p>
+      <w:pPr>
+        <w:pStyle w:val="Heading2"/>
+        <w:keepNext/>
+        <w:keepLines/>
+        <w:spacing w:after="80" w:before="180"/>
+      </w:pPr>
+      <w:r>
+        <w:rPr>
+          <w:rFonts w:ascii="Calibri" w:cs="Calibri" w:eastAsia="Calibri" w:hAnsi="Calibri"/>
+          <w:b/>
+          <w:bCs/>
+          <w:color w:val="1A1A1A"/>
+          <w:sz w:val="20"/>
+          <w:szCs w:val="20"/>
+        </w:rPr>
+        <w:t xml:space="preserve">No SETUP button on the box?</w:t>
+      </w:r>
+    </w:p>
+    <w:p>
+      <w:pPr>
+        <w:keepNext/>
+        <w:spacing w:after="100" w:before="60" w:line="264"/>
+      </w:pPr>
+      <w:r>
+        <w:rPr>
+          <w:rFonts w:ascii="Calibri" w:cs="Calibri" w:eastAsia="Calibri" w:hAnsi="Calibri"/>
+          <w:sz w:val="19"/>
+          <w:szCs w:val="19"/>
+        </w:rPr>
+        <w:t xml:space="preserve">Older boxes have none. This boot-time window also works on a box that has one, and is the only route left if the box stops before it starts running.</w:t>
+      </w:r>
+    </w:p>
+    <w:p>
+      <w:pPr>
+        <w:pStyle w:val="ListParagraph"/>
+        <w:keepLines/>
+        <w:numPr>
+          <w:ilvl w:val="0"/>
+          <w:numId w:val="5"/>
+        </w:numPr>
+        <w:spacing w:after="40" w:before="40" w:line="264"/>
+      </w:pPr>
+      <w:r>
+        <w:rPr>
+          <w:rFonts w:ascii="Calibri" w:cs="Calibri" w:eastAsia="Calibri" w:hAnsi="Calibri"/>
+          <w:sz w:val="19"/>
+          <w:szCs w:val="19"/>
+        </w:rPr>
+        <w:t xml:space="preserve">Plug the box in — </w:t>
+      </w:r>
+      <w:r>
+        <w:rPr>
+          <w:rFonts w:ascii="Calibri" w:cs="Calibri" w:eastAsia="Calibri" w:hAnsi="Calibri"/>
+          <w:b/>
+          <w:bCs/>
+          <w:sz w:val="19"/>
+          <w:szCs w:val="19"/>
+        </w:rPr>
+        <w:t xml:space="preserve">do not touch any button yet</w:t>
+      </w:r>
+      <w:r>
+        <w:rPr>
+          <w:rFonts w:ascii="Calibri" w:cs="Calibri" w:eastAsia="Calibri" w:hAnsi="Calibri"/>
+          <w:sz w:val="19"/>
+          <w:szCs w:val="19"/>
+        </w:rPr>
+        <w:t xml:space="preserve">.</w:t>
+      </w:r>
+    </w:p>
+    <w:p>
+      <w:pPr>
+        <w:pStyle w:val="ListParagraph"/>
+        <w:keepLines/>
+        <w:numPr>
+          <w:ilvl w:val="0"/>
+          <w:numId w:val="5"/>
+        </w:numPr>
+        <w:spacing w:after="40" w:before="40" w:line="264"/>
+      </w:pPr>
+      <w:r>
+        <w:rPr>
+          <w:rFonts w:ascii="Calibri" w:cs="Calibri" w:eastAsia="Calibri" w:hAnsi="Calibri"/>
+          <w:sz w:val="19"/>
+          <w:szCs w:val="19"/>
+        </w:rPr>
+        <w:t xml:space="preserve">After about 4 seconds the light turns </w:t>
+      </w:r>
+      <w:r>
+        <w:rPr>
+          <w:rFonts w:ascii="Calibri" w:cs="Calibri" w:eastAsia="Calibri" w:hAnsi="Calibri"/>
+          <w:b/>
+          <w:bCs/>
+          <w:sz w:val="19"/>
+          <w:szCs w:val="19"/>
+        </w:rPr>
+        <w:t xml:space="preserve">magenta</w:t>
+      </w:r>
+      <w:r>
+        <w:rPr>
+          <w:rFonts w:ascii="Calibri" w:cs="Calibri" w:eastAsia="Calibri" w:hAnsi="Calibri"/>
+          <w:sz w:val="19"/>
+          <w:szCs w:val="19"/>
+        </w:rPr>
+        <w:t xml:space="preserve">.</w:t>
+      </w:r>
+    </w:p>
+    <w:p>
+      <w:pPr>
+        <w:pStyle w:val="ListParagraph"/>
+        <w:keepLines/>
+        <w:numPr>
+          <w:ilvl w:val="0"/>
+          <w:numId w:val="5"/>
+        </w:numPr>
+        <w:spacing w:after="40" w:before="40" w:line="264"/>
+      </w:pPr>
+      <w:r>
+        <w:rPr>
+          <w:rFonts w:ascii="Calibri" w:cs="Calibri" w:eastAsia="Calibri" w:hAnsi="Calibri"/>
+          <w:sz w:val="19"/>
+          <w:szCs w:val="19"/>
+        </w:rPr>
+        <w:t xml:space="preserve">While it is magenta, </w:t>
+      </w:r>
+      <w:r>
+        <w:rPr>
+          <w:rFonts w:ascii="Calibri" w:cs="Calibri" w:eastAsia="Calibri" w:hAnsi="Calibri"/>
+          <w:b/>
+          <w:bCs/>
+          <w:sz w:val="19"/>
+          <w:szCs w:val="19"/>
+        </w:rPr>
+        <w:t xml:space="preserve">press BOOT once</w:t>
+      </w:r>
+      <w:r>
+        <w:rPr>
+          <w:rFonts w:ascii="Calibri" w:cs="Calibri" w:eastAsia="Calibri" w:hAnsi="Calibri"/>
+          <w:sz w:val="19"/>
+          <w:szCs w:val="19"/>
+        </w:rPr>
+        <w:t xml:space="preserve"> (marked </w:t>
       </w:r>
       <w:r>
         <w:rPr>
@@ -3124,62 +3501,32 @@
           <w:sz w:val="18"/>
           <w:szCs w:val="18"/>
         </w:rPr>
-        <w:t xml:space="preserve">3000</w:t>
-      </w:r>
-      <w:r>
-        <w:rPr>
-          <w:rFonts w:ascii="Calibri" w:cs="Calibri" w:eastAsia="Calibri" w:hAnsi="Calibri"/>
-          <w:sz w:val="19"/>
-          <w:szCs w:val="19"/>
-        </w:rPr>
-        <w:t xml:space="preserve">.</w:t>
-      </w:r>
-    </w:p>
-    <w:p>
-      <w:pPr>
-        <w:pStyle w:val="ListParagraph"/>
-        <w:keepLines/>
-        <w:numPr>
-          <w:ilvl w:val="0"/>
-          <w:numId w:val="4"/>
-        </w:numPr>
-        <w:spacing w:after="40" w:before="40" w:line="264"/>
-      </w:pPr>
-      <w:r>
-        <w:rPr>
-          <w:rFonts w:ascii="Calibri" w:cs="Calibri" w:eastAsia="Calibri" w:hAnsi="Calibri"/>
-          <w:b/>
-          <w:bCs/>
-          <w:sz w:val="19"/>
-          <w:szCs w:val="19"/>
-        </w:rPr>
-        <w:t xml:space="preserve">Save</w:t>
-      </w:r>
-      <w:r>
-        <w:rPr>
-          <w:rFonts w:ascii="Calibri" w:cs="Calibri" w:eastAsia="Calibri" w:hAnsi="Calibri"/>
-          <w:sz w:val="19"/>
-          <w:szCs w:val="19"/>
-        </w:rPr>
-        <w:t xml:space="preserve">, and wait for the page to say </w:t>
-      </w:r>
-      <w:r>
-        <w:rPr>
-          <w:rFonts w:ascii="Calibri" w:cs="Calibri" w:eastAsia="Calibri" w:hAnsi="Calibri"/>
-          <w:b/>
-          <w:bCs/>
-          <w:sz w:val="19"/>
-          <w:szCs w:val="19"/>
-        </w:rPr>
-        <w:t xml:space="preserve">Connected</w:t>
-      </w:r>
-      <w:r>
-        <w:rPr>
-          <w:rFonts w:ascii="Calibri" w:cs="Calibri" w:eastAsia="Calibri" w:hAnsi="Calibri"/>
-          <w:sz w:val="19"/>
-          <w:szCs w:val="19"/>
-        </w:rPr>
-        <w:t xml:space="preserve">.</w:t>
+        <w:t xml:space="preserve">BOOT</w:t>
+      </w:r>
+      <w:r>
+        <w:rPr>
+          <w:rFonts w:ascii="Calibri" w:cs="Calibri" w:eastAsia="Calibri" w:hAnsi="Calibri"/>
+          <w:sz w:val="19"/>
+          <w:szCs w:val="19"/>
+        </w:rPr>
+        <w:t xml:space="preserve"> or </w:t>
+      </w:r>
+      <w:r>
+        <w:rPr>
+          <w:rFonts w:ascii="Consolas" w:cs="Consolas" w:eastAsia="Consolas" w:hAnsi="Consolas"/>
+          <w:color w:val="2B3A55"/>
+          <w:sz w:val="18"/>
+          <w:szCs w:val="18"/>
+        </w:rPr>
+        <w:t xml:space="preserve">IO0</w:t>
+      </w:r>
+      <w:r>
+        <w:rPr>
+          <w:rFonts w:ascii="Calibri" w:cs="Calibri" w:eastAsia="Calibri" w:hAnsi="Calibri"/>
+          <w:sz w:val="19"/>
+          <w:szCs w:val="19"/>
+        </w:rPr>
+        <w:t xml:space="preserve">), then carry on from step 3 above.</w:t>
       </w:r>
     </w:p>
     <w:p>
@@ -3208,6 +3555,134 @@
           <w:szCs w:val="19"/>
         </w:rPr>
         <w:t xml:space="preserve">That puts the chip in programming mode and it stops running. Unplug and start again.</w:t>
+      </w:r>
+    </w:p>
+    <w:p>
+      <w:pPr>
+        <w:pStyle w:val="Heading2"/>
+        <w:keepNext/>
+        <w:keepLines/>
+        <w:spacing w:after="80" w:before="180"/>
+      </w:pPr>
+      <w:r>
+        <w:rPr>
+          <w:rFonts w:ascii="Calibri" w:cs="Calibri" w:eastAsia="Calibri" w:hAnsi="Calibri"/>
+          <w:b/>
+          <w:bCs/>
+          <w:color w:val="1A1A1A"/>
+          <w:sz w:val="20"/>
+          <w:szCs w:val="20"/>
+        </w:rPr>
+        <w:t xml:space="preserve">Fitting a SETUP button</w:t>
+      </w:r>
+    </w:p>
+    <w:p>
+      <w:pPr>
+        <w:spacing w:after="100" w:before="60" w:line="264"/>
+      </w:pPr>
+      <w:r>
+        <w:rPr>
+          <w:rFonts w:ascii="Calibri" w:cs="Calibri" w:eastAsia="Calibri" w:hAnsi="Calibri"/>
+          <w:sz w:val="19"/>
+          <w:szCs w:val="19"/>
+        </w:rPr>
+        <w:t xml:space="preserve">Once, with the box </w:t>
+      </w:r>
+      <w:r>
+        <w:rPr>
+          <w:rFonts w:ascii="Calibri" w:cs="Calibri" w:eastAsia="Calibri" w:hAnsi="Calibri"/>
+          <w:b/>
+          <w:bCs/>
+          <w:sz w:val="19"/>
+          <w:szCs w:val="19"/>
+        </w:rPr>
+        <w:t xml:space="preserve">unplugged</w:t>
+      </w:r>
+      <w:r>
+        <w:rPr>
+          <w:rFonts w:ascii="Calibri" w:cs="Calibri" w:eastAsia="Calibri" w:hAnsi="Calibri"/>
+          <w:sz w:val="19"/>
+          <w:szCs w:val="19"/>
+        </w:rPr>
+        <w:t xml:space="preserve">. Any momentary push-button: one leg to </w:t>
+      </w:r>
+      <w:r>
+        <w:rPr>
+          <w:rFonts w:ascii="Consolas" w:cs="Consolas" w:eastAsia="Consolas" w:hAnsi="Consolas"/>
+          <w:color w:val="2B3A55"/>
+          <w:sz w:val="18"/>
+          <w:szCs w:val="18"/>
+        </w:rPr>
+        <w:t xml:space="preserve">GPIO 13</w:t>
+      </w:r>
+      <w:r>
+        <w:rPr>
+          <w:rFonts w:ascii="Calibri" w:cs="Calibri" w:eastAsia="Calibri" w:hAnsi="Calibri"/>
+          <w:sz w:val="19"/>
+          <w:szCs w:val="19"/>
+        </w:rPr>
+        <w:t xml:space="preserve">, the other to </w:t>
+      </w:r>
+      <w:r>
+        <w:rPr>
+          <w:rFonts w:ascii="Consolas" w:cs="Consolas" w:eastAsia="Consolas" w:hAnsi="Consolas"/>
+          <w:color w:val="2B3A55"/>
+          <w:sz w:val="18"/>
+          <w:szCs w:val="18"/>
+        </w:rPr>
+        <w:t xml:space="preserve">GND</w:t>
+      </w:r>
+      <w:r>
+        <w:rPr>
+          <w:rFonts w:ascii="Calibri" w:cs="Calibri" w:eastAsia="Calibri" w:hAnsi="Calibri"/>
+          <w:sz w:val="19"/>
+          <w:szCs w:val="19"/>
+        </w:rPr>
+        <w:t xml:space="preserve">. No resistor, nothing else to add. Label it </w:t>
+      </w:r>
+      <w:r>
+        <w:rPr>
+          <w:rFonts w:ascii="Consolas" w:cs="Consolas" w:eastAsia="Consolas" w:hAnsi="Consolas"/>
+          <w:color w:val="2B3A55"/>
+          <w:sz w:val="18"/>
+          <w:szCs w:val="18"/>
+        </w:rPr>
+        <w:t xml:space="preserve">SETUP</w:t>
+      </w:r>
+      <w:r>
+        <w:rPr>
+          <w:rFonts w:ascii="Calibri" w:cs="Calibri" w:eastAsia="Calibri" w:hAnsi="Calibri"/>
+          <w:sz w:val="19"/>
+          <w:szCs w:val="19"/>
+        </w:rPr>
+        <w:t xml:space="preserve">.</w:t>
+      </w:r>
+    </w:p>
+    <w:p>
+      <w:pPr>
+        <w:pBdr>
+          <w:left w:val="single" w:color="A81F12" w:sz="18" w:space="8"/>
+        </w:pBdr>
+        <w:shd w:fill="FBEDEA" w:color="auto" w:val="clear"/>
+        <w:spacing w:after="140" w:before="140" w:line="264"/>
+        <w:ind w:left="180" w:right="180"/>
+      </w:pPr>
+      <w:r>
+        <w:rPr>
+          <w:rFonts w:ascii="Consolas" w:cs="Consolas" w:eastAsia="Consolas" w:hAnsi="Consolas"/>
+          <w:color w:val="2B3A55"/>
+          <w:sz w:val="18"/>
+          <w:szCs w:val="18"/>
+        </w:rPr>
+        <w:t xml:space="preserve">GPIO 13</w:t>
+      </w:r>
+      <w:r>
+        <w:rPr>
+          <w:rFonts w:ascii="Calibri" w:cs="Calibri" w:eastAsia="Calibri" w:hAnsi="Calibri"/>
+          <w:sz w:val="19"/>
+          <w:szCs w:val="19"/>
+        </w:rPr>
+        <w:t xml:space="preserve"> and nothing else. The other pins left free on this board are either strapping pins — a button on one of them stops the box booting — or memory lines.</w:t>
       </w:r>
     </w:p>
     <w:p>
@@ -3240,7 +3715,7 @@
         <w:keepLines/>
         <w:numPr>
           <w:ilvl w:val="0"/>
-          <w:numId w:val="5"/>
+          <w:numId w:val="6"/>
         </w:numPr>
         <w:spacing w:after="40" w:before="40" w:line="264"/>
       </w:pPr>
@@ -3260,7 +3735,7 @@
         <w:keepLines/>
         <w:numPr>
           <w:ilvl w:val="0"/>
-          <w:numId w:val="5"/>
+          <w:numId w:val="6"/>
         </w:numPr>
         <w:spacing w:after="40" w:before="40" w:line="264"/>
       </w:pPr>
@@ -3280,7 +3755,7 @@
         <w:keepLines/>
         <w:numPr>
           <w:ilvl w:val="0"/>
-          <w:numId w:val="5"/>
+          <w:numId w:val="6"/>
         </w:numPr>
         <w:spacing w:after="40" w:before="40" w:line="264"/>
       </w:pPr>
@@ -3300,7 +3775,7 @@
         <w:keepLines/>
         <w:numPr>
           <w:ilvl w:val="0"/>
-          <w:numId w:val="5"/>
+          <w:numId w:val="6"/>
         </w:numPr>
         <w:spacing w:after="40" w:before="40" w:line="264"/>
       </w:pPr>
@@ -3310,7 +3785,7 @@
           <w:sz w:val="19"/>
           <w:szCs w:val="19"/>
         </w:rPr>
-        <w:t xml:space="preserve">Remove the coin cell from the clock module.</w:t>
+        <w:t xml:space="preserve">Wire the SETUP button to 3.3 V or 5 V — it goes to GND.</w:t>
       </w:r>
     </w:p>
     <w:p>
@@ -3320,7 +3795,27 @@
         <w:keepLines/>
         <w:numPr>
           <w:ilvl w:val="0"/>
-          <w:numId w:val="5"/>
+          <w:numId w:val="6"/>
+        </w:numPr>
+        <w:spacing w:after="40" w:before="40" w:line="264"/>
+      </w:pPr>
+      <w:r>
+        <w:rPr>
+          <w:rFonts w:ascii="Calibri" w:cs="Calibri" w:eastAsia="Calibri" w:hAnsi="Calibri"/>
+          <w:sz w:val="19"/>
+          <w:szCs w:val="19"/>
+        </w:rPr>
+        <w:t xml:space="preserve">Remove the coin cell from the clock module.</w:t>
+      </w:r>
+    </w:p>
+    <w:p>
+      <w:pPr>
+        <w:pStyle w:val="ListParagraph"/>
+        <w:keepNext/>
+        <w:keepLines/>
+        <w:numPr>
+          <w:ilvl w:val="0"/>
+          <w:numId w:val="6"/>
         </w:numPr>
         <w:spacing w:after="40" w:before="40" w:line="264"/>
       </w:pPr>
@@ -3340,7 +3835,7 @@
         <w:keepLines/>
         <w:numPr>
           <w:ilvl w:val="0"/>
-          <w:numId w:val="5"/>
+          <w:numId w:val="6"/>
         </w:numPr>
         <w:spacing w:after="40" w:before="40" w:line="264"/>
       </w:pPr>
@@ -3775,6 +4270,130 @@
                 <w:szCs w:val="19"/>
               </w:rPr>
               <w:t xml:space="preserve">Check the aim, and that the unit is registered → section 3</w:t>
+            </w:r>
+          </w:p>
+        </w:tc>
+      </w:tr>
+      <w:tr>
+        <w:trPr>
+          <w:tblHeader w:val="false"/>
+        </w:trPr>
+        <w:tc>
+          <w:tcPr>
+            <w:tcW w:type="dxa" w:w="4093"/>
+            <w:tcMar>
+              <w:top w:type="dxa" w:w="60"/>
+              <w:left w:type="dxa" w:w="110"/>
+              <w:bottom w:type="dxa" w:w="60"/>
+              <w:right w:type="dxa" w:w="110"/>
+            </w:tcMar>
+          </w:tcPr>
+          <w:p>
+            <w:pPr>
+              <w:spacing w:after="0" w:before="0" w:line="252"/>
+            </w:pPr>
+            <w:r>
+              <w:rPr>
+                <w:rFonts w:ascii="Calibri" w:cs="Calibri" w:eastAsia="Calibri" w:hAnsi="Calibri"/>
+                <w:sz w:val="19"/>
+                <w:szCs w:val="19"/>
+              </w:rPr>
+              <w:t xml:space="preserve">Nothing happens when I hold SETUP</w:t>
+            </w:r>
+          </w:p>
+        </w:tc>
+        <w:tc>
+          <w:tcPr>
+            <w:tcW w:type="dxa" w:w="5653"/>
+            <w:tcMar>
+              <w:top w:type="dxa" w:w="60"/>
+              <w:left w:type="dxa" w:w="110"/>
+              <w:bottom w:type="dxa" w:w="60"/>
+              <w:right w:type="dxa" w:w="110"/>
+            </w:tcMar>
+          </w:tcPr>
+          <w:p>
+            <w:pPr>
+              <w:spacing w:after="0" w:before="0" w:line="252"/>
+            </w:pPr>
+            <w:r>
+              <w:rPr>
+                <w:rFonts w:ascii="Calibri" w:cs="Calibri" w:eastAsia="Calibri" w:hAnsi="Calibri"/>
+                <w:sz w:val="19"/>
+                <w:szCs w:val="19"/>
+              </w:rPr>
+              <w:t xml:space="preserve">Hold a full 3 s without letting go. In an alarm there is no magenta — watch for the green blink</w:t>
+            </w:r>
+          </w:p>
+        </w:tc>
+      </w:tr>
+      <w:tr>
+        <w:trPr>
+          <w:tblHeader w:val="false"/>
+        </w:trPr>
+        <w:tc>
+          <w:tcPr>
+            <w:tcW w:type="dxa" w:w="4093"/>
+            <w:tcMar>
+              <w:top w:type="dxa" w:w="60"/>
+              <w:left w:type="dxa" w:w="110"/>
+              <w:bottom w:type="dxa" w:w="60"/>
+              <w:right w:type="dxa" w:w="110"/>
+            </w:tcMar>
+          </w:tcPr>
+          <w:p>
+            <w:pPr>
+              <w:spacing w:after="0" w:before="0" w:line="252"/>
+            </w:pPr>
+            <w:r>
+              <w:rPr>
+                <w:rFonts w:ascii="Calibri" w:cs="Calibri" w:eastAsia="Calibri" w:hAnsi="Calibri"/>
+                <w:sz w:val="19"/>
+                <w:szCs w:val="19"/>
+              </w:rPr>
+              <w:t xml:space="preserve">Setup page never came back after the restart</w:t>
+            </w:r>
+          </w:p>
+        </w:tc>
+        <w:tc>
+          <w:tcPr>
+            <w:tcW w:type="dxa" w:w="5653"/>
+            <w:tcMar>
+              <w:top w:type="dxa" w:w="60"/>
+              <w:left w:type="dxa" w:w="110"/>
+              <w:bottom w:type="dxa" w:w="60"/>
+              <w:right w:type="dxa" w:w="110"/>
+            </w:tcMar>
+          </w:tcPr>
+          <w:p>
+            <w:pPr>
+              <w:spacing w:after="0" w:before="0" w:line="252"/>
+            </w:pPr>
+            <w:r>
+              <w:rPr>
+                <w:rFonts w:ascii="Calibri" w:cs="Calibri" w:eastAsia="Calibri" w:hAnsi="Calibri"/>
+                <w:sz w:val="19"/>
+                <w:szCs w:val="19"/>
+              </w:rPr>
+              <w:t xml:space="preserve">It waits 3 minutes, then returns to monitoring. Hold </w:t>
+            </w:r>
+            <w:r>
+              <w:rPr>
+                <w:rFonts w:ascii="Calibri" w:cs="Calibri" w:eastAsia="Calibri" w:hAnsi="Calibri"/>
+                <w:b/>
+                <w:bCs/>
+                <w:sz w:val="19"/>
+                <w:szCs w:val="19"/>
+              </w:rPr>
+              <w:t xml:space="preserve">SETUP</w:t>
+            </w:r>
+            <w:r>
+              <w:rPr>
+                <w:rFonts w:ascii="Calibri" w:cs="Calibri" w:eastAsia="Calibri" w:hAnsi="Calibri"/>
+                <w:sz w:val="19"/>
+                <w:szCs w:val="19"/>
+              </w:rPr>
+              <w:t xml:space="preserve"> again → section 5</w:t>
             </w:r>
           </w:p>
         </w:tc>
@@ -4074,6 +4693,12 @@
     </w:lvlOverride>
   </w:num>
   <w:num w:numId="5">
+    <w:abstractNumId w:val="2"/>
+    <w:lvlOverride w:ilvl="0">
+      <w:startOverride w:val="1"/>
+    </w:lvlOverride>
+  </w:num>
+  <w:num w:numId="6">
     <w:abstractNumId w:val="3"/>
     <w:lvlOverride w:ilvl="0">
       <w:startOverride w:val="1"/>

</xml_diff>